<commit_message>
Haftalar animasyonlu, kod İngilizce ve testli; izlence, ön gereksinimler ve proje rehberi sunumlu
- 12 öğretim haftası: tarayıcıda çalışan adım adım animasyonlar (111 animasyon; hazır örnekler,
  rastgele ve kendi değerler, satır satır program sayacı ve dal notları), her konuya doğuş ve tarihçe
- Tüm kod, dosya ve klasör adları İngilizce; her demo için birim ve uçtan uca testler
  (code/run_tests.py: Windows MSVC + Linux, ASan/UBSan)
- Notlar ve sunumlar gerçek çıktılarla güncellendi; sunum, PDF, PPTX, DOCX ve paketler yeniden üretildi
- Ön gereksinimler ve proje rehberi sayfalarına sunum ve indirme dosyaları eklendi
</commit_message>
<xml_diff>
--- a/docs/syllabus/cen429-izlence-ders-notu.tr.docx
+++ b/docs/syllabus/cen429-izlence-ders-notu.tr.docx
@@ -2739,7 +2739,7 @@
               <w:pStyle w:val="Compact"/>
             </w:pPr>
             <w:r>
-              <w:t xml:space="preserve">Tigress ve çeşitlendirme: Tigress ile C kaynak kodu dönüşümleri (kontrol akışı düzleştirme, sanallaştırma, sabit ve aritmetik kodlama, opak yüklemler, fonksiyon bölme ve birleştirme); gizleme yöntemlerinin birleştirilmesi; çeşitlendirme ile her kopya için farklı ikili; saldırılara karşı savunma ve gizlenmiş kodun analize dayanıklılığının değerlendirilmesi.</w:t>
+              <w:t xml:space="preserve">Tigress ve çeşitlendirme: Tigress ile C kaynak kodu dönüşümleri (kontrol akışı düzleştirme, sanallaştırma, sabit ve aritmetik kodlama, opak yüklemler, fonksiyon bölme ve birleştirme); gizleme yöntemlerinin birleştirilmesi; çeşitlendirme ile her kopya için farklı binary; saldırılara karşı savunma ve gizlenmiş kodun analize dayanıklılığının değerlendirilmesi.</w:t>
             </w:r>
           </w:p>
         </w:tc>
@@ -3667,7 +3667,7 @@
         <w:t xml:space="preserve"> </w:t>
       </w:r>
       <w:r>
-        <w:t xml:space="preserve">uygulaması (ÖÇ.2), güvenli iletişim (ÖÇ.4), varlık yönetimi (ÖÇ.5), ikili uygulama korumaları (ÖÇ.3), güvenlik testi</w:t>
+        <w:t xml:space="preserve">uygulaması (ÖÇ.2), güvenli iletişim (ÖÇ.4), varlık yönetimi (ÖÇ.5), binary uygulama korumaları (ÖÇ.3), güvenlik testi</w:t>
       </w:r>
       <w:r>
         <w:t xml:space="preserve"> </w:t>

</xml_diff>